<commit_message>
fix(báo cáo): gán cấp đề cương cho tiêu đề h1-h4 để hiện trong Navigation Pane của Word
Co-Authored-By: Claude Opus 5.5 <noreply@anthropic.com>
</commit_message>
<xml_diff>
--- a/reports/final_report.docx
+++ b/reports/final_report.docx
@@ -829,7 +829,7 @@
         <w:pStyle w:val="36"/>
       </w:pPr>
       <w:bookmarkStart w:id="0" w:name="_Toc200285851"/>
-      <w:bookmarkStart w:id="1" w:name="_Toc18725"/>
+      <w:bookmarkStart w:id="1" w:name="_Toc29826"/>
       <w:r>
         <w:t>MỤC LỤC</w:t>
       </w:r>
@@ -856,7 +856,7 @@
         <w:fldChar w:fldCharType="begin"/>
       </w:r>
       <w:r>
-        <w:instrText xml:space="preserve"> HYPERLINK \l _Toc18725 </w:instrText>
+        <w:instrText xml:space="preserve"> HYPERLINK \l _Toc29826 </w:instrText>
       </w:r>
       <w:r>
         <w:fldChar w:fldCharType="separate"/>
@@ -871,7 +871,7 @@
         <w:fldChar w:fldCharType="begin"/>
       </w:r>
       <w:r>
-        <w:instrText xml:space="preserve"> PAGEREF _Toc18725 \h </w:instrText>
+        <w:instrText xml:space="preserve"> PAGEREF _Toc29826 \h </w:instrText>
       </w:r>
       <w:r>
         <w:fldChar w:fldCharType="separate"/>
@@ -897,7 +897,7 @@
         <w:fldChar w:fldCharType="begin"/>
       </w:r>
       <w:r>
-        <w:instrText xml:space="preserve"> HYPERLINK \l _Toc385 </w:instrText>
+        <w:instrText xml:space="preserve"> HYPERLINK \l _Toc30108 </w:instrText>
       </w:r>
       <w:r>
         <w:fldChar w:fldCharType="separate"/>
@@ -912,7 +912,7 @@
         <w:fldChar w:fldCharType="begin"/>
       </w:r>
       <w:r>
-        <w:instrText xml:space="preserve"> PAGEREF _Toc385 \h </w:instrText>
+        <w:instrText xml:space="preserve"> PAGEREF _Toc30108 \h </w:instrText>
       </w:r>
       <w:r>
         <w:fldChar w:fldCharType="separate"/>
@@ -938,7 +938,7 @@
         <w:fldChar w:fldCharType="begin"/>
       </w:r>
       <w:r>
-        <w:instrText xml:space="preserve"> HYPERLINK \l _Toc22582 </w:instrText>
+        <w:instrText xml:space="preserve"> HYPERLINK \l _Toc2174 </w:instrText>
       </w:r>
       <w:r>
         <w:fldChar w:fldCharType="separate"/>
@@ -953,7 +953,7 @@
         <w:fldChar w:fldCharType="begin"/>
       </w:r>
       <w:r>
-        <w:instrText xml:space="preserve"> PAGEREF _Toc22582 \h </w:instrText>
+        <w:instrText xml:space="preserve"> PAGEREF _Toc2174 \h </w:instrText>
       </w:r>
       <w:r>
         <w:fldChar w:fldCharType="separate"/>
@@ -979,7 +979,7 @@
         <w:fldChar w:fldCharType="begin"/>
       </w:r>
       <w:r>
-        <w:instrText xml:space="preserve"> HYPERLINK \l _Toc27887 </w:instrText>
+        <w:instrText xml:space="preserve"> HYPERLINK \l _Toc10425 </w:instrText>
       </w:r>
       <w:r>
         <w:fldChar w:fldCharType="separate"/>
@@ -1000,7 +1000,7 @@
         <w:fldChar w:fldCharType="begin"/>
       </w:r>
       <w:r>
-        <w:instrText xml:space="preserve"> PAGEREF _Toc27887 \h </w:instrText>
+        <w:instrText xml:space="preserve"> PAGEREF _Toc10425 \h </w:instrText>
       </w:r>
       <w:r>
         <w:fldChar w:fldCharType="separate"/>
@@ -1026,7 +1026,7 @@
         <w:fldChar w:fldCharType="begin"/>
       </w:r>
       <w:r>
-        <w:instrText xml:space="preserve"> HYPERLINK \l _Toc23470 </w:instrText>
+        <w:instrText xml:space="preserve"> HYPERLINK \l _Toc11032 </w:instrText>
       </w:r>
       <w:r>
         <w:fldChar w:fldCharType="separate"/>
@@ -1047,7 +1047,7 @@
         <w:fldChar w:fldCharType="begin"/>
       </w:r>
       <w:r>
-        <w:instrText xml:space="preserve"> PAGEREF _Toc23470 \h </w:instrText>
+        <w:instrText xml:space="preserve"> PAGEREF _Toc11032 \h </w:instrText>
       </w:r>
       <w:r>
         <w:fldChar w:fldCharType="separate"/>
@@ -1073,7 +1073,7 @@
         <w:fldChar w:fldCharType="begin"/>
       </w:r>
       <w:r>
-        <w:instrText xml:space="preserve"> HYPERLINK \l _Toc25183 </w:instrText>
+        <w:instrText xml:space="preserve"> HYPERLINK \l _Toc29111 </w:instrText>
       </w:r>
       <w:r>
         <w:fldChar w:fldCharType="separate"/>
@@ -1094,7 +1094,7 @@
         <w:fldChar w:fldCharType="begin"/>
       </w:r>
       <w:r>
-        <w:instrText xml:space="preserve"> PAGEREF _Toc25183 \h </w:instrText>
+        <w:instrText xml:space="preserve"> PAGEREF _Toc29111 \h </w:instrText>
       </w:r>
       <w:r>
         <w:fldChar w:fldCharType="separate"/>
@@ -1120,7 +1120,7 @@
         <w:fldChar w:fldCharType="begin"/>
       </w:r>
       <w:r>
-        <w:instrText xml:space="preserve"> HYPERLINK \l _Toc2156 </w:instrText>
+        <w:instrText xml:space="preserve"> HYPERLINK \l _Toc4051 </w:instrText>
       </w:r>
       <w:r>
         <w:fldChar w:fldCharType="separate"/>
@@ -1141,7 +1141,7 @@
         <w:fldChar w:fldCharType="begin"/>
       </w:r>
       <w:r>
-        <w:instrText xml:space="preserve"> PAGEREF _Toc2156 \h </w:instrText>
+        <w:instrText xml:space="preserve"> PAGEREF _Toc4051 \h </w:instrText>
       </w:r>
       <w:r>
         <w:fldChar w:fldCharType="separate"/>
@@ -1167,7 +1167,7 @@
         <w:fldChar w:fldCharType="begin"/>
       </w:r>
       <w:r>
-        <w:instrText xml:space="preserve"> HYPERLINK \l _Toc3861 </w:instrText>
+        <w:instrText xml:space="preserve"> HYPERLINK \l _Toc3589 </w:instrText>
       </w:r>
       <w:r>
         <w:fldChar w:fldCharType="separate"/>
@@ -1188,7 +1188,7 @@
         <w:fldChar w:fldCharType="begin"/>
       </w:r>
       <w:r>
-        <w:instrText xml:space="preserve"> PAGEREF _Toc3861 \h </w:instrText>
+        <w:instrText xml:space="preserve"> PAGEREF _Toc3589 \h </w:instrText>
       </w:r>
       <w:r>
         <w:fldChar w:fldCharType="separate"/>
@@ -1214,7 +1214,7 @@
         <w:fldChar w:fldCharType="begin"/>
       </w:r>
       <w:r>
-        <w:instrText xml:space="preserve"> HYPERLINK \l _Toc23322 </w:instrText>
+        <w:instrText xml:space="preserve"> HYPERLINK \l _Toc16014 </w:instrText>
       </w:r>
       <w:r>
         <w:fldChar w:fldCharType="separate"/>
@@ -1235,7 +1235,7 @@
         <w:fldChar w:fldCharType="begin"/>
       </w:r>
       <w:r>
-        <w:instrText xml:space="preserve"> PAGEREF _Toc23322 \h </w:instrText>
+        <w:instrText xml:space="preserve"> PAGEREF _Toc16014 \h </w:instrText>
       </w:r>
       <w:r>
         <w:fldChar w:fldCharType="separate"/>
@@ -1258,7 +1258,7 @@
         <w:fldChar w:fldCharType="begin"/>
       </w:r>
       <w:r>
-        <w:instrText xml:space="preserve"> HYPERLINK \l _Toc14267 </w:instrText>
+        <w:instrText xml:space="preserve"> HYPERLINK \l _Toc19845 </w:instrText>
       </w:r>
       <w:r>
         <w:fldChar w:fldCharType="separate"/>
@@ -1273,7 +1273,7 @@
         <w:fldChar w:fldCharType="begin"/>
       </w:r>
       <w:r>
-        <w:instrText xml:space="preserve"> PAGEREF _Toc14267 \h </w:instrText>
+        <w:instrText xml:space="preserve"> PAGEREF _Toc19845 \h </w:instrText>
       </w:r>
       <w:r>
         <w:fldChar w:fldCharType="separate"/>
@@ -1296,7 +1296,7 @@
         <w:fldChar w:fldCharType="begin"/>
       </w:r>
       <w:r>
-        <w:instrText xml:space="preserve"> HYPERLINK \l _Toc32187 </w:instrText>
+        <w:instrText xml:space="preserve"> HYPERLINK \l _Toc6429 </w:instrText>
       </w:r>
       <w:r>
         <w:fldChar w:fldCharType="separate"/>
@@ -1311,7 +1311,7 @@
         <w:fldChar w:fldCharType="begin"/>
       </w:r>
       <w:r>
-        <w:instrText xml:space="preserve"> PAGEREF _Toc32187 \h </w:instrText>
+        <w:instrText xml:space="preserve"> PAGEREF _Toc6429 \h </w:instrText>
       </w:r>
       <w:r>
         <w:fldChar w:fldCharType="separate"/>
@@ -1334,7 +1334,7 @@
         <w:fldChar w:fldCharType="begin"/>
       </w:r>
       <w:r>
-        <w:instrText xml:space="preserve"> HYPERLINK \l _Toc32319 </w:instrText>
+        <w:instrText xml:space="preserve"> HYPERLINK \l _Toc32334 </w:instrText>
       </w:r>
       <w:r>
         <w:fldChar w:fldCharType="separate"/>
@@ -1349,7 +1349,7 @@
         <w:fldChar w:fldCharType="begin"/>
       </w:r>
       <w:r>
-        <w:instrText xml:space="preserve"> PAGEREF _Toc32319 \h </w:instrText>
+        <w:instrText xml:space="preserve"> PAGEREF _Toc32334 \h </w:instrText>
       </w:r>
       <w:r>
         <w:fldChar w:fldCharType="separate"/>
@@ -1375,7 +1375,7 @@
         <w:fldChar w:fldCharType="begin"/>
       </w:r>
       <w:r>
-        <w:instrText xml:space="preserve"> HYPERLINK \l _Toc4758 </w:instrText>
+        <w:instrText xml:space="preserve"> HYPERLINK \l _Toc8837 </w:instrText>
       </w:r>
       <w:r>
         <w:fldChar w:fldCharType="separate"/>
@@ -1396,7 +1396,7 @@
         <w:fldChar w:fldCharType="begin"/>
       </w:r>
       <w:r>
-        <w:instrText xml:space="preserve"> PAGEREF _Toc4758 \h </w:instrText>
+        <w:instrText xml:space="preserve"> PAGEREF _Toc8837 \h </w:instrText>
       </w:r>
       <w:r>
         <w:fldChar w:fldCharType="separate"/>
@@ -1422,7 +1422,7 @@
         <w:fldChar w:fldCharType="begin"/>
       </w:r>
       <w:r>
-        <w:instrText xml:space="preserve"> HYPERLINK \l _Toc11163 </w:instrText>
+        <w:instrText xml:space="preserve"> HYPERLINK \l _Toc30576 </w:instrText>
       </w:r>
       <w:r>
         <w:fldChar w:fldCharType="separate"/>
@@ -1443,7 +1443,7 @@
         <w:fldChar w:fldCharType="begin"/>
       </w:r>
       <w:r>
-        <w:instrText xml:space="preserve"> PAGEREF _Toc11163 \h </w:instrText>
+        <w:instrText xml:space="preserve"> PAGEREF _Toc30576 \h </w:instrText>
       </w:r>
       <w:r>
         <w:fldChar w:fldCharType="separate"/>
@@ -1469,7 +1469,7 @@
         <w:fldChar w:fldCharType="begin"/>
       </w:r>
       <w:r>
-        <w:instrText xml:space="preserve"> HYPERLINK \l _Toc22366 </w:instrText>
+        <w:instrText xml:space="preserve"> HYPERLINK \l _Toc15661 </w:instrText>
       </w:r>
       <w:r>
         <w:fldChar w:fldCharType="separate"/>
@@ -1490,7 +1490,7 @@
         <w:fldChar w:fldCharType="begin"/>
       </w:r>
       <w:r>
-        <w:instrText xml:space="preserve"> PAGEREF _Toc22366 \h </w:instrText>
+        <w:instrText xml:space="preserve"> PAGEREF _Toc15661 \h </w:instrText>
       </w:r>
       <w:r>
         <w:fldChar w:fldCharType="separate"/>
@@ -1516,7 +1516,7 @@
         <w:fldChar w:fldCharType="begin"/>
       </w:r>
       <w:r>
-        <w:instrText xml:space="preserve"> HYPERLINK \l _Toc17612 </w:instrText>
+        <w:instrText xml:space="preserve"> HYPERLINK \l _Toc17130 </w:instrText>
       </w:r>
       <w:r>
         <w:fldChar w:fldCharType="separate"/>
@@ -1537,7 +1537,7 @@
         <w:fldChar w:fldCharType="begin"/>
       </w:r>
       <w:r>
-        <w:instrText xml:space="preserve"> PAGEREF _Toc17612 \h </w:instrText>
+        <w:instrText xml:space="preserve"> PAGEREF _Toc17130 \h </w:instrText>
       </w:r>
       <w:r>
         <w:fldChar w:fldCharType="separate"/>
@@ -1563,7 +1563,7 @@
         <w:fldChar w:fldCharType="begin"/>
       </w:r>
       <w:r>
-        <w:instrText xml:space="preserve"> HYPERLINK \l _Toc27347 </w:instrText>
+        <w:instrText xml:space="preserve"> HYPERLINK \l _Toc32646 </w:instrText>
       </w:r>
       <w:r>
         <w:fldChar w:fldCharType="separate"/>
@@ -1584,7 +1584,7 @@
         <w:fldChar w:fldCharType="begin"/>
       </w:r>
       <w:r>
-        <w:instrText xml:space="preserve"> PAGEREF _Toc27347 \h </w:instrText>
+        <w:instrText xml:space="preserve"> PAGEREF _Toc32646 \h </w:instrText>
       </w:r>
       <w:r>
         <w:fldChar w:fldCharType="separate"/>
@@ -1607,7 +1607,7 @@
         <w:fldChar w:fldCharType="begin"/>
       </w:r>
       <w:r>
-        <w:instrText xml:space="preserve"> HYPERLINK \l _Toc11390 </w:instrText>
+        <w:instrText xml:space="preserve"> HYPERLINK \l _Toc10286 </w:instrText>
       </w:r>
       <w:r>
         <w:fldChar w:fldCharType="separate"/>
@@ -1622,7 +1622,7 @@
         <w:fldChar w:fldCharType="begin"/>
       </w:r>
       <w:r>
-        <w:instrText xml:space="preserve"> PAGEREF _Toc11390 \h </w:instrText>
+        <w:instrText xml:space="preserve"> PAGEREF _Toc10286 \h </w:instrText>
       </w:r>
       <w:r>
         <w:fldChar w:fldCharType="separate"/>
@@ -1645,7 +1645,7 @@
         <w:fldChar w:fldCharType="begin"/>
       </w:r>
       <w:r>
-        <w:instrText xml:space="preserve"> HYPERLINK \l _Toc4140 </w:instrText>
+        <w:instrText xml:space="preserve"> HYPERLINK \l _Toc31472 </w:instrText>
       </w:r>
       <w:r>
         <w:fldChar w:fldCharType="separate"/>
@@ -1660,7 +1660,7 @@
         <w:fldChar w:fldCharType="begin"/>
       </w:r>
       <w:r>
-        <w:instrText xml:space="preserve"> PAGEREF _Toc4140 \h </w:instrText>
+        <w:instrText xml:space="preserve"> PAGEREF _Toc31472 \h </w:instrText>
       </w:r>
       <w:r>
         <w:fldChar w:fldCharType="separate"/>
@@ -1686,7 +1686,7 @@
         <w:fldChar w:fldCharType="begin"/>
       </w:r>
       <w:r>
-        <w:instrText xml:space="preserve"> HYPERLINK \l _Toc24387 </w:instrText>
+        <w:instrText xml:space="preserve"> HYPERLINK \l _Toc9193 </w:instrText>
       </w:r>
       <w:r>
         <w:fldChar w:fldCharType="separate"/>
@@ -1707,7 +1707,7 @@
         <w:fldChar w:fldCharType="begin"/>
       </w:r>
       <w:r>
-        <w:instrText xml:space="preserve"> PAGEREF _Toc24387 \h </w:instrText>
+        <w:instrText xml:space="preserve"> PAGEREF _Toc9193 \h </w:instrText>
       </w:r>
       <w:r>
         <w:fldChar w:fldCharType="separate"/>
@@ -1730,7 +1730,7 @@
         <w:fldChar w:fldCharType="begin"/>
       </w:r>
       <w:r>
-        <w:instrText xml:space="preserve"> HYPERLINK \l _Toc26377 </w:instrText>
+        <w:instrText xml:space="preserve"> HYPERLINK \l _Toc28403 </w:instrText>
       </w:r>
       <w:r>
         <w:fldChar w:fldCharType="separate"/>
@@ -1745,7 +1745,7 @@
         <w:fldChar w:fldCharType="begin"/>
       </w:r>
       <w:r>
-        <w:instrText xml:space="preserve"> PAGEREF _Toc26377 \h </w:instrText>
+        <w:instrText xml:space="preserve"> PAGEREF _Toc28403 \h </w:instrText>
       </w:r>
       <w:r>
         <w:fldChar w:fldCharType="separate"/>
@@ -1768,7 +1768,7 @@
         <w:fldChar w:fldCharType="begin"/>
       </w:r>
       <w:r>
-        <w:instrText xml:space="preserve"> HYPERLINK \l _Toc1609 </w:instrText>
+        <w:instrText xml:space="preserve"> HYPERLINK \l _Toc32488 </w:instrText>
       </w:r>
       <w:r>
         <w:fldChar w:fldCharType="separate"/>
@@ -1783,7 +1783,7 @@
         <w:fldChar w:fldCharType="begin"/>
       </w:r>
       <w:r>
-        <w:instrText xml:space="preserve"> PAGEREF _Toc1609 \h </w:instrText>
+        <w:instrText xml:space="preserve"> PAGEREF _Toc32488 \h </w:instrText>
       </w:r>
       <w:r>
         <w:fldChar w:fldCharType="separate"/>
@@ -1806,7 +1806,7 @@
         <w:fldChar w:fldCharType="begin"/>
       </w:r>
       <w:r>
-        <w:instrText xml:space="preserve"> HYPERLINK \l _Toc959 </w:instrText>
+        <w:instrText xml:space="preserve"> HYPERLINK \l _Toc29436 </w:instrText>
       </w:r>
       <w:r>
         <w:fldChar w:fldCharType="separate"/>
@@ -1821,7 +1821,7 @@
         <w:fldChar w:fldCharType="begin"/>
       </w:r>
       <w:r>
-        <w:instrText xml:space="preserve"> PAGEREF _Toc959 \h </w:instrText>
+        <w:instrText xml:space="preserve"> PAGEREF _Toc29436 \h </w:instrText>
       </w:r>
       <w:r>
         <w:fldChar w:fldCharType="separate"/>
@@ -1844,7 +1844,7 @@
         <w:fldChar w:fldCharType="begin"/>
       </w:r>
       <w:r>
-        <w:instrText xml:space="preserve"> HYPERLINK \l _Toc15593 </w:instrText>
+        <w:instrText xml:space="preserve"> HYPERLINK \l _Toc1365 </w:instrText>
       </w:r>
       <w:r>
         <w:fldChar w:fldCharType="separate"/>
@@ -1859,7 +1859,7 @@
         <w:fldChar w:fldCharType="begin"/>
       </w:r>
       <w:r>
-        <w:instrText xml:space="preserve"> PAGEREF _Toc15593 \h </w:instrText>
+        <w:instrText xml:space="preserve"> PAGEREF _Toc1365 \h </w:instrText>
       </w:r>
       <w:r>
         <w:fldChar w:fldCharType="separate"/>
@@ -1882,7 +1882,7 @@
         <w:fldChar w:fldCharType="begin"/>
       </w:r>
       <w:r>
-        <w:instrText xml:space="preserve"> HYPERLINK \l _Toc29500 </w:instrText>
+        <w:instrText xml:space="preserve"> HYPERLINK \l _Toc13117 </w:instrText>
       </w:r>
       <w:r>
         <w:fldChar w:fldCharType="separate"/>
@@ -1897,7 +1897,7 @@
         <w:fldChar w:fldCharType="begin"/>
       </w:r>
       <w:r>
-        <w:instrText xml:space="preserve"> PAGEREF _Toc29500 \h </w:instrText>
+        <w:instrText xml:space="preserve"> PAGEREF _Toc13117 \h </w:instrText>
       </w:r>
       <w:r>
         <w:fldChar w:fldCharType="separate"/>
@@ -1923,7 +1923,7 @@
         <w:fldChar w:fldCharType="begin"/>
       </w:r>
       <w:r>
-        <w:instrText xml:space="preserve"> HYPERLINK \l _Toc1924 </w:instrText>
+        <w:instrText xml:space="preserve"> HYPERLINK \l _Toc10396 </w:instrText>
       </w:r>
       <w:r>
         <w:fldChar w:fldCharType="separate"/>
@@ -1944,7 +1944,7 @@
         <w:fldChar w:fldCharType="begin"/>
       </w:r>
       <w:r>
-        <w:instrText xml:space="preserve"> PAGEREF _Toc1924 \h </w:instrText>
+        <w:instrText xml:space="preserve"> PAGEREF _Toc10396 \h </w:instrText>
       </w:r>
       <w:r>
         <w:fldChar w:fldCharType="separate"/>
@@ -1970,7 +1970,7 @@
         <w:fldChar w:fldCharType="begin"/>
       </w:r>
       <w:r>
-        <w:instrText xml:space="preserve"> HYPERLINK \l _Toc20181 </w:instrText>
+        <w:instrText xml:space="preserve"> HYPERLINK \l _Toc361 </w:instrText>
       </w:r>
       <w:r>
         <w:fldChar w:fldCharType="separate"/>
@@ -1991,7 +1991,7 @@
         <w:fldChar w:fldCharType="begin"/>
       </w:r>
       <w:r>
-        <w:instrText xml:space="preserve"> PAGEREF _Toc20181 \h </w:instrText>
+        <w:instrText xml:space="preserve"> PAGEREF _Toc361 \h </w:instrText>
       </w:r>
       <w:r>
         <w:fldChar w:fldCharType="separate"/>
@@ -2014,7 +2014,7 @@
         <w:fldChar w:fldCharType="begin"/>
       </w:r>
       <w:r>
-        <w:instrText xml:space="preserve"> HYPERLINK \l _Toc11922 </w:instrText>
+        <w:instrText xml:space="preserve"> HYPERLINK \l _Toc27064 </w:instrText>
       </w:r>
       <w:r>
         <w:fldChar w:fldCharType="separate"/>
@@ -2029,7 +2029,7 @@
         <w:fldChar w:fldCharType="begin"/>
       </w:r>
       <w:r>
-        <w:instrText xml:space="preserve"> PAGEREF _Toc11922 \h </w:instrText>
+        <w:instrText xml:space="preserve"> PAGEREF _Toc27064 \h </w:instrText>
       </w:r>
       <w:r>
         <w:fldChar w:fldCharType="separate"/>
@@ -2052,7 +2052,7 @@
         <w:fldChar w:fldCharType="begin"/>
       </w:r>
       <w:r>
-        <w:instrText xml:space="preserve"> HYPERLINK \l _Toc26558 </w:instrText>
+        <w:instrText xml:space="preserve"> HYPERLINK \l _Toc16472 </w:instrText>
       </w:r>
       <w:r>
         <w:fldChar w:fldCharType="separate"/>
@@ -2067,7 +2067,7 @@
         <w:fldChar w:fldCharType="begin"/>
       </w:r>
       <w:r>
-        <w:instrText xml:space="preserve"> PAGEREF _Toc26558 \h </w:instrText>
+        <w:instrText xml:space="preserve"> PAGEREF _Toc16472 \h </w:instrText>
       </w:r>
       <w:r>
         <w:fldChar w:fldCharType="separate"/>
@@ -2090,7 +2090,7 @@
         <w:fldChar w:fldCharType="begin"/>
       </w:r>
       <w:r>
-        <w:instrText xml:space="preserve"> HYPERLINK \l _Toc1734 </w:instrText>
+        <w:instrText xml:space="preserve"> HYPERLINK \l _Toc5824 </w:instrText>
       </w:r>
       <w:r>
         <w:fldChar w:fldCharType="separate"/>
@@ -2105,7 +2105,7 @@
         <w:fldChar w:fldCharType="begin"/>
       </w:r>
       <w:r>
-        <w:instrText xml:space="preserve"> PAGEREF _Toc1734 \h </w:instrText>
+        <w:instrText xml:space="preserve"> PAGEREF _Toc5824 \h </w:instrText>
       </w:r>
       <w:r>
         <w:fldChar w:fldCharType="separate"/>
@@ -2131,7 +2131,7 @@
         <w:fldChar w:fldCharType="begin"/>
       </w:r>
       <w:r>
-        <w:instrText xml:space="preserve"> HYPERLINK \l _Toc3830 </w:instrText>
+        <w:instrText xml:space="preserve"> HYPERLINK \l _Toc10722 </w:instrText>
       </w:r>
       <w:r>
         <w:fldChar w:fldCharType="separate"/>
@@ -2152,7 +2152,7 @@
         <w:fldChar w:fldCharType="begin"/>
       </w:r>
       <w:r>
-        <w:instrText xml:space="preserve"> PAGEREF _Toc3830 \h </w:instrText>
+        <w:instrText xml:space="preserve"> PAGEREF _Toc10722 \h </w:instrText>
       </w:r>
       <w:r>
         <w:fldChar w:fldCharType="separate"/>
@@ -2178,7 +2178,7 @@
         <w:fldChar w:fldCharType="begin"/>
       </w:r>
       <w:r>
-        <w:instrText xml:space="preserve"> HYPERLINK \l _Toc14263 </w:instrText>
+        <w:instrText xml:space="preserve"> HYPERLINK \l _Toc32223 </w:instrText>
       </w:r>
       <w:r>
         <w:fldChar w:fldCharType="separate"/>
@@ -2199,7 +2199,7 @@
         <w:fldChar w:fldCharType="begin"/>
       </w:r>
       <w:r>
-        <w:instrText xml:space="preserve"> PAGEREF _Toc14263 \h </w:instrText>
+        <w:instrText xml:space="preserve"> PAGEREF _Toc32223 \h </w:instrText>
       </w:r>
       <w:r>
         <w:fldChar w:fldCharType="separate"/>
@@ -2225,7 +2225,7 @@
         <w:fldChar w:fldCharType="begin"/>
       </w:r>
       <w:r>
-        <w:instrText xml:space="preserve"> HYPERLINK \l _Toc26101 </w:instrText>
+        <w:instrText xml:space="preserve"> HYPERLINK \l _Toc10348 </w:instrText>
       </w:r>
       <w:r>
         <w:fldChar w:fldCharType="separate"/>
@@ -2246,7 +2246,7 @@
         <w:fldChar w:fldCharType="begin"/>
       </w:r>
       <w:r>
-        <w:instrText xml:space="preserve"> PAGEREF _Toc26101 \h </w:instrText>
+        <w:instrText xml:space="preserve"> PAGEREF _Toc10348 \h </w:instrText>
       </w:r>
       <w:r>
         <w:fldChar w:fldCharType="separate"/>
@@ -2272,7 +2272,7 @@
         <w:fldChar w:fldCharType="begin"/>
       </w:r>
       <w:r>
-        <w:instrText xml:space="preserve"> HYPERLINK \l _Toc23662 </w:instrText>
+        <w:instrText xml:space="preserve"> HYPERLINK \l _Toc2344 </w:instrText>
       </w:r>
       <w:r>
         <w:fldChar w:fldCharType="separate"/>
@@ -2293,7 +2293,7 @@
         <w:fldChar w:fldCharType="begin"/>
       </w:r>
       <w:r>
-        <w:instrText xml:space="preserve"> PAGEREF _Toc23662 \h </w:instrText>
+        <w:instrText xml:space="preserve"> PAGEREF _Toc2344 \h </w:instrText>
       </w:r>
       <w:r>
         <w:fldChar w:fldCharType="separate"/>
@@ -2319,7 +2319,7 @@
         <w:fldChar w:fldCharType="begin"/>
       </w:r>
       <w:r>
-        <w:instrText xml:space="preserve"> HYPERLINK \l _Toc17752 </w:instrText>
+        <w:instrText xml:space="preserve"> HYPERLINK \l _Toc2555 </w:instrText>
       </w:r>
       <w:r>
         <w:fldChar w:fldCharType="separate"/>
@@ -2340,7 +2340,7 @@
         <w:fldChar w:fldCharType="begin"/>
       </w:r>
       <w:r>
-        <w:instrText xml:space="preserve"> PAGEREF _Toc17752 \h </w:instrText>
+        <w:instrText xml:space="preserve"> PAGEREF _Toc2555 \h </w:instrText>
       </w:r>
       <w:r>
         <w:fldChar w:fldCharType="separate"/>
@@ -2366,7 +2366,7 @@
         <w:fldChar w:fldCharType="begin"/>
       </w:r>
       <w:r>
-        <w:instrText xml:space="preserve"> HYPERLINK \l _Toc30153 </w:instrText>
+        <w:instrText xml:space="preserve"> HYPERLINK \l _Toc4574 </w:instrText>
       </w:r>
       <w:r>
         <w:fldChar w:fldCharType="separate"/>
@@ -2387,7 +2387,7 @@
         <w:fldChar w:fldCharType="begin"/>
       </w:r>
       <w:r>
-        <w:instrText xml:space="preserve"> PAGEREF _Toc30153 \h </w:instrText>
+        <w:instrText xml:space="preserve"> PAGEREF _Toc4574 \h </w:instrText>
       </w:r>
       <w:r>
         <w:fldChar w:fldCharType="separate"/>
@@ -2413,7 +2413,7 @@
         <w:fldChar w:fldCharType="begin"/>
       </w:r>
       <w:r>
-        <w:instrText xml:space="preserve"> HYPERLINK \l _Toc29278 </w:instrText>
+        <w:instrText xml:space="preserve"> HYPERLINK \l _Toc16590 </w:instrText>
       </w:r>
       <w:r>
         <w:fldChar w:fldCharType="separate"/>
@@ -2434,7 +2434,7 @@
         <w:fldChar w:fldCharType="begin"/>
       </w:r>
       <w:r>
-        <w:instrText xml:space="preserve"> PAGEREF _Toc29278 \h </w:instrText>
+        <w:instrText xml:space="preserve"> PAGEREF _Toc16590 \h </w:instrText>
       </w:r>
       <w:r>
         <w:fldChar w:fldCharType="separate"/>
@@ -2460,7 +2460,7 @@
         <w:fldChar w:fldCharType="begin"/>
       </w:r>
       <w:r>
-        <w:instrText xml:space="preserve"> HYPERLINK \l _Toc9364 </w:instrText>
+        <w:instrText xml:space="preserve"> HYPERLINK \l _Toc28457 </w:instrText>
       </w:r>
       <w:r>
         <w:fldChar w:fldCharType="separate"/>
@@ -2481,7 +2481,7 @@
         <w:fldChar w:fldCharType="begin"/>
       </w:r>
       <w:r>
-        <w:instrText xml:space="preserve"> PAGEREF _Toc9364 \h </w:instrText>
+        <w:instrText xml:space="preserve"> PAGEREF _Toc28457 \h </w:instrText>
       </w:r>
       <w:r>
         <w:fldChar w:fldCharType="separate"/>
@@ -2507,7 +2507,7 @@
         <w:fldChar w:fldCharType="begin"/>
       </w:r>
       <w:r>
-        <w:instrText xml:space="preserve"> HYPERLINK \l _Toc24831 </w:instrText>
+        <w:instrText xml:space="preserve"> HYPERLINK \l _Toc17861 </w:instrText>
       </w:r>
       <w:r>
         <w:fldChar w:fldCharType="separate"/>
@@ -2528,7 +2528,7 @@
         <w:fldChar w:fldCharType="begin"/>
       </w:r>
       <w:r>
-        <w:instrText xml:space="preserve"> PAGEREF _Toc24831 \h </w:instrText>
+        <w:instrText xml:space="preserve"> PAGEREF _Toc17861 \h </w:instrText>
       </w:r>
       <w:r>
         <w:fldChar w:fldCharType="separate"/>
@@ -2551,7 +2551,7 @@
         <w:fldChar w:fldCharType="begin"/>
       </w:r>
       <w:r>
-        <w:instrText xml:space="preserve"> HYPERLINK \l _Toc4549 </w:instrText>
+        <w:instrText xml:space="preserve"> HYPERLINK \l _Toc9044 </w:instrText>
       </w:r>
       <w:r>
         <w:fldChar w:fldCharType="separate"/>
@@ -2566,7 +2566,7 @@
         <w:fldChar w:fldCharType="begin"/>
       </w:r>
       <w:r>
-        <w:instrText xml:space="preserve"> PAGEREF _Toc4549 \h </w:instrText>
+        <w:instrText xml:space="preserve"> PAGEREF _Toc9044 \h </w:instrText>
       </w:r>
       <w:r>
         <w:fldChar w:fldCharType="separate"/>
@@ -2589,7 +2589,7 @@
         <w:fldChar w:fldCharType="begin"/>
       </w:r>
       <w:r>
-        <w:instrText xml:space="preserve"> HYPERLINK \l _Toc28626 </w:instrText>
+        <w:instrText xml:space="preserve"> HYPERLINK \l _Toc4910 </w:instrText>
       </w:r>
       <w:r>
         <w:fldChar w:fldCharType="separate"/>
@@ -2604,7 +2604,7 @@
         <w:fldChar w:fldCharType="begin"/>
       </w:r>
       <w:r>
-        <w:instrText xml:space="preserve"> PAGEREF _Toc28626 \h </w:instrText>
+        <w:instrText xml:space="preserve"> PAGEREF _Toc4910 \h </w:instrText>
       </w:r>
       <w:r>
         <w:fldChar w:fldCharType="separate"/>
@@ -2627,7 +2627,7 @@
         <w:fldChar w:fldCharType="begin"/>
       </w:r>
       <w:r>
-        <w:instrText xml:space="preserve"> HYPERLINK \l _Toc23872 </w:instrText>
+        <w:instrText xml:space="preserve"> HYPERLINK \l _Toc25599 </w:instrText>
       </w:r>
       <w:r>
         <w:fldChar w:fldCharType="separate"/>
@@ -2642,7 +2642,7 @@
         <w:fldChar w:fldCharType="begin"/>
       </w:r>
       <w:r>
-        <w:instrText xml:space="preserve"> PAGEREF _Toc23872 \h </w:instrText>
+        <w:instrText xml:space="preserve"> PAGEREF _Toc25599 \h </w:instrText>
       </w:r>
       <w:r>
         <w:fldChar w:fldCharType="separate"/>
@@ -2665,7 +2665,7 @@
         <w:fldChar w:fldCharType="begin"/>
       </w:r>
       <w:r>
-        <w:instrText xml:space="preserve"> HYPERLINK \l _Toc13352 </w:instrText>
+        <w:instrText xml:space="preserve"> HYPERLINK \l _Toc8865 </w:instrText>
       </w:r>
       <w:r>
         <w:fldChar w:fldCharType="separate"/>
@@ -2680,7 +2680,7 @@
         <w:fldChar w:fldCharType="begin"/>
       </w:r>
       <w:r>
-        <w:instrText xml:space="preserve"> PAGEREF _Toc13352 \h </w:instrText>
+        <w:instrText xml:space="preserve"> PAGEREF _Toc8865 \h </w:instrText>
       </w:r>
       <w:r>
         <w:fldChar w:fldCharType="separate"/>
@@ -2706,7 +2706,7 @@
         <w:fldChar w:fldCharType="begin"/>
       </w:r>
       <w:r>
-        <w:instrText xml:space="preserve"> HYPERLINK \l _Toc28681 </w:instrText>
+        <w:instrText xml:space="preserve"> HYPERLINK \l _Toc23792 </w:instrText>
       </w:r>
       <w:r>
         <w:fldChar w:fldCharType="separate"/>
@@ -2727,7 +2727,7 @@
         <w:fldChar w:fldCharType="begin"/>
       </w:r>
       <w:r>
-        <w:instrText xml:space="preserve"> PAGEREF _Toc28681 \h </w:instrText>
+        <w:instrText xml:space="preserve"> PAGEREF _Toc23792 \h </w:instrText>
       </w:r>
       <w:r>
         <w:fldChar w:fldCharType="separate"/>
@@ -2750,7 +2750,7 @@
         <w:fldChar w:fldCharType="begin"/>
       </w:r>
       <w:r>
-        <w:instrText xml:space="preserve"> HYPERLINK \l _Toc24584 </w:instrText>
+        <w:instrText xml:space="preserve"> HYPERLINK \l _Toc28434 </w:instrText>
       </w:r>
       <w:r>
         <w:fldChar w:fldCharType="separate"/>
@@ -2765,7 +2765,7 @@
         <w:fldChar w:fldCharType="begin"/>
       </w:r>
       <w:r>
-        <w:instrText xml:space="preserve"> PAGEREF _Toc24584 \h </w:instrText>
+        <w:instrText xml:space="preserve"> PAGEREF _Toc28434 \h </w:instrText>
       </w:r>
       <w:r>
         <w:fldChar w:fldCharType="separate"/>
@@ -2788,7 +2788,7 @@
         <w:fldChar w:fldCharType="begin"/>
       </w:r>
       <w:r>
-        <w:instrText xml:space="preserve"> HYPERLINK \l _Toc13529 </w:instrText>
+        <w:instrText xml:space="preserve"> HYPERLINK \l _Toc19052 </w:instrText>
       </w:r>
       <w:r>
         <w:fldChar w:fldCharType="separate"/>
@@ -2803,7 +2803,7 @@
         <w:fldChar w:fldCharType="begin"/>
       </w:r>
       <w:r>
-        <w:instrText xml:space="preserve"> PAGEREF _Toc13529 \h </w:instrText>
+        <w:instrText xml:space="preserve"> PAGEREF _Toc19052 \h </w:instrText>
       </w:r>
       <w:r>
         <w:fldChar w:fldCharType="separate"/>
@@ -2826,7 +2826,7 @@
         <w:fldChar w:fldCharType="begin"/>
       </w:r>
       <w:r>
-        <w:instrText xml:space="preserve"> HYPERLINK \l _Toc22760 </w:instrText>
+        <w:instrText xml:space="preserve"> HYPERLINK \l _Toc17489 </w:instrText>
       </w:r>
       <w:r>
         <w:fldChar w:fldCharType="separate"/>
@@ -2841,7 +2841,7 @@
         <w:fldChar w:fldCharType="begin"/>
       </w:r>
       <w:r>
-        <w:instrText xml:space="preserve"> PAGEREF _Toc22760 \h </w:instrText>
+        <w:instrText xml:space="preserve"> PAGEREF _Toc17489 \h </w:instrText>
       </w:r>
       <w:r>
         <w:fldChar w:fldCharType="separate"/>
@@ -2864,7 +2864,7 @@
         <w:fldChar w:fldCharType="begin"/>
       </w:r>
       <w:r>
-        <w:instrText xml:space="preserve"> HYPERLINK \l _Toc4710 </w:instrText>
+        <w:instrText xml:space="preserve"> HYPERLINK \l _Toc12084 </w:instrText>
       </w:r>
       <w:r>
         <w:fldChar w:fldCharType="separate"/>
@@ -2879,7 +2879,7 @@
         <w:fldChar w:fldCharType="begin"/>
       </w:r>
       <w:r>
-        <w:instrText xml:space="preserve"> PAGEREF _Toc4710 \h </w:instrText>
+        <w:instrText xml:space="preserve"> PAGEREF _Toc12084 \h </w:instrText>
       </w:r>
       <w:r>
         <w:fldChar w:fldCharType="separate"/>
@@ -2902,7 +2902,7 @@
         <w:fldChar w:fldCharType="begin"/>
       </w:r>
       <w:r>
-        <w:instrText xml:space="preserve"> HYPERLINK \l _Toc3420 </w:instrText>
+        <w:instrText xml:space="preserve"> HYPERLINK \l _Toc12163 </w:instrText>
       </w:r>
       <w:r>
         <w:fldChar w:fldCharType="separate"/>
@@ -2917,7 +2917,7 @@
         <w:fldChar w:fldCharType="begin"/>
       </w:r>
       <w:r>
-        <w:instrText xml:space="preserve"> PAGEREF _Toc3420 \h </w:instrText>
+        <w:instrText xml:space="preserve"> PAGEREF _Toc12163 \h </w:instrText>
       </w:r>
       <w:r>
         <w:fldChar w:fldCharType="separate"/>
@@ -2943,7 +2943,7 @@
         <w:fldChar w:fldCharType="begin"/>
       </w:r>
       <w:r>
-        <w:instrText xml:space="preserve"> HYPERLINK \l _Toc7392 </w:instrText>
+        <w:instrText xml:space="preserve"> HYPERLINK \l _Toc19362 </w:instrText>
       </w:r>
       <w:r>
         <w:fldChar w:fldCharType="separate"/>
@@ -2964,7 +2964,7 @@
         <w:fldChar w:fldCharType="begin"/>
       </w:r>
       <w:r>
-        <w:instrText xml:space="preserve"> PAGEREF _Toc7392 \h </w:instrText>
+        <w:instrText xml:space="preserve"> PAGEREF _Toc19362 \h </w:instrText>
       </w:r>
       <w:r>
         <w:fldChar w:fldCharType="separate"/>
@@ -2990,7 +2990,7 @@
         <w:fldChar w:fldCharType="begin"/>
       </w:r>
       <w:r>
-        <w:instrText xml:space="preserve"> HYPERLINK \l _Toc18705 </w:instrText>
+        <w:instrText xml:space="preserve"> HYPERLINK \l _Toc16469 </w:instrText>
       </w:r>
       <w:r>
         <w:fldChar w:fldCharType="separate"/>
@@ -3011,7 +3011,7 @@
         <w:fldChar w:fldCharType="begin"/>
       </w:r>
       <w:r>
-        <w:instrText xml:space="preserve"> PAGEREF _Toc18705 \h </w:instrText>
+        <w:instrText xml:space="preserve"> PAGEREF _Toc16469 \h </w:instrText>
       </w:r>
       <w:r>
         <w:fldChar w:fldCharType="separate"/>
@@ -3037,7 +3037,7 @@
         <w:fldChar w:fldCharType="begin"/>
       </w:r>
       <w:r>
-        <w:instrText xml:space="preserve"> HYPERLINK \l _Toc24694 </w:instrText>
+        <w:instrText xml:space="preserve"> HYPERLINK \l _Toc26233 </w:instrText>
       </w:r>
       <w:r>
         <w:fldChar w:fldCharType="separate"/>
@@ -3058,7 +3058,7 @@
         <w:fldChar w:fldCharType="begin"/>
       </w:r>
       <w:r>
-        <w:instrText xml:space="preserve"> PAGEREF _Toc24694 \h </w:instrText>
+        <w:instrText xml:space="preserve"> PAGEREF _Toc26233 \h </w:instrText>
       </w:r>
       <w:r>
         <w:fldChar w:fldCharType="separate"/>
@@ -3084,7 +3084,7 @@
         <w:fldChar w:fldCharType="begin"/>
       </w:r>
       <w:r>
-        <w:instrText xml:space="preserve"> HYPERLINK \l _Toc462 </w:instrText>
+        <w:instrText xml:space="preserve"> HYPERLINK \l _Toc2309 </w:instrText>
       </w:r>
       <w:r>
         <w:fldChar w:fldCharType="separate"/>
@@ -3105,7 +3105,7 @@
         <w:fldChar w:fldCharType="begin"/>
       </w:r>
       <w:r>
-        <w:instrText xml:space="preserve"> PAGEREF _Toc462 \h </w:instrText>
+        <w:instrText xml:space="preserve"> PAGEREF _Toc2309 \h </w:instrText>
       </w:r>
       <w:r>
         <w:fldChar w:fldCharType="separate"/>
@@ -3128,7 +3128,7 @@
         <w:fldChar w:fldCharType="begin"/>
       </w:r>
       <w:r>
-        <w:instrText xml:space="preserve"> HYPERLINK \l _Toc29918 </w:instrText>
+        <w:instrText xml:space="preserve"> HYPERLINK \l _Toc15715 </w:instrText>
       </w:r>
       <w:r>
         <w:fldChar w:fldCharType="separate"/>
@@ -3143,7 +3143,7 @@
         <w:fldChar w:fldCharType="begin"/>
       </w:r>
       <w:r>
-        <w:instrText xml:space="preserve"> PAGEREF _Toc29918 \h </w:instrText>
+        <w:instrText xml:space="preserve"> PAGEREF _Toc15715 \h </w:instrText>
       </w:r>
       <w:r>
         <w:fldChar w:fldCharType="separate"/>
@@ -3166,7 +3166,7 @@
         <w:fldChar w:fldCharType="begin"/>
       </w:r>
       <w:r>
-        <w:instrText xml:space="preserve"> HYPERLINK \l _Toc11605 </w:instrText>
+        <w:instrText xml:space="preserve"> HYPERLINK \l _Toc31604 </w:instrText>
       </w:r>
       <w:r>
         <w:fldChar w:fldCharType="separate"/>
@@ -3181,7 +3181,7 @@
         <w:fldChar w:fldCharType="begin"/>
       </w:r>
       <w:r>
-        <w:instrText xml:space="preserve"> PAGEREF _Toc11605 \h </w:instrText>
+        <w:instrText xml:space="preserve"> PAGEREF _Toc31604 \h </w:instrText>
       </w:r>
       <w:r>
         <w:fldChar w:fldCharType="separate"/>
@@ -3207,7 +3207,7 @@
         <w:fldChar w:fldCharType="begin"/>
       </w:r>
       <w:r>
-        <w:instrText xml:space="preserve"> HYPERLINK \l _Toc18991 </w:instrText>
+        <w:instrText xml:space="preserve"> HYPERLINK \l _Toc25140 </w:instrText>
       </w:r>
       <w:r>
         <w:fldChar w:fldCharType="separate"/>
@@ -3228,7 +3228,7 @@
         <w:fldChar w:fldCharType="begin"/>
       </w:r>
       <w:r>
-        <w:instrText xml:space="preserve"> PAGEREF _Toc18991 \h </w:instrText>
+        <w:instrText xml:space="preserve"> PAGEREF _Toc25140 \h </w:instrText>
       </w:r>
       <w:r>
         <w:fldChar w:fldCharType="separate"/>
@@ -3254,7 +3254,7 @@
         <w:fldChar w:fldCharType="begin"/>
       </w:r>
       <w:r>
-        <w:instrText xml:space="preserve"> HYPERLINK \l _Toc28494 </w:instrText>
+        <w:instrText xml:space="preserve"> HYPERLINK \l _Toc29645 </w:instrText>
       </w:r>
       <w:r>
         <w:fldChar w:fldCharType="separate"/>
@@ -3275,7 +3275,7 @@
         <w:fldChar w:fldCharType="begin"/>
       </w:r>
       <w:r>
-        <w:instrText xml:space="preserve"> PAGEREF _Toc28494 \h </w:instrText>
+        <w:instrText xml:space="preserve"> PAGEREF _Toc29645 \h </w:instrText>
       </w:r>
       <w:r>
         <w:fldChar w:fldCharType="separate"/>
@@ -3301,7 +3301,7 @@
         <w:fldChar w:fldCharType="begin"/>
       </w:r>
       <w:r>
-        <w:instrText xml:space="preserve"> HYPERLINK \l _Toc24986 </w:instrText>
+        <w:instrText xml:space="preserve"> HYPERLINK \l _Toc13159 </w:instrText>
       </w:r>
       <w:r>
         <w:fldChar w:fldCharType="separate"/>
@@ -3322,7 +3322,7 @@
         <w:fldChar w:fldCharType="begin"/>
       </w:r>
       <w:r>
-        <w:instrText xml:space="preserve"> PAGEREF _Toc24986 \h </w:instrText>
+        <w:instrText xml:space="preserve"> PAGEREF _Toc13159 \h </w:instrText>
       </w:r>
       <w:r>
         <w:fldChar w:fldCharType="separate"/>
@@ -3348,7 +3348,7 @@
         <w:fldChar w:fldCharType="begin"/>
       </w:r>
       <w:r>
-        <w:instrText xml:space="preserve"> HYPERLINK \l _Toc10158 </w:instrText>
+        <w:instrText xml:space="preserve"> HYPERLINK \l _Toc1433 </w:instrText>
       </w:r>
       <w:r>
         <w:fldChar w:fldCharType="separate"/>
@@ -3363,7 +3363,7 @@
         <w:fldChar w:fldCharType="begin"/>
       </w:r>
       <w:r>
-        <w:instrText xml:space="preserve"> PAGEREF _Toc10158 \h </w:instrText>
+        <w:instrText xml:space="preserve"> PAGEREF _Toc1433 \h </w:instrText>
       </w:r>
       <w:r>
         <w:fldChar w:fldCharType="separate"/>
@@ -3389,7 +3389,7 @@
         <w:fldChar w:fldCharType="begin"/>
       </w:r>
       <w:r>
-        <w:instrText xml:space="preserve"> HYPERLINK \l _Toc30905 </w:instrText>
+        <w:instrText xml:space="preserve"> HYPERLINK \l _Toc20855 </w:instrText>
       </w:r>
       <w:r>
         <w:fldChar w:fldCharType="separate"/>
@@ -3404,7 +3404,7 @@
         <w:fldChar w:fldCharType="begin"/>
       </w:r>
       <w:r>
-        <w:instrText xml:space="preserve"> PAGEREF _Toc30905 \h </w:instrText>
+        <w:instrText xml:space="preserve"> PAGEREF _Toc20855 \h </w:instrText>
       </w:r>
       <w:r>
         <w:fldChar w:fldCharType="separate"/>
@@ -3443,7 +3443,7 @@
         <w:pStyle w:val="36"/>
       </w:pPr>
       <w:bookmarkStart w:id="2" w:name="_Toc200285852"/>
-      <w:bookmarkStart w:id="3" w:name="_Toc385"/>
+      <w:bookmarkStart w:id="3" w:name="_Toc30108"/>
       <w:r>
         <w:t>DANH MỤC HÌNH ẢNH</w:t>
       </w:r>
@@ -4431,7 +4431,7 @@
         <w:pStyle w:val="36"/>
       </w:pPr>
       <w:bookmarkStart w:id="4" w:name="_Toc200285853"/>
-      <w:bookmarkStart w:id="5" w:name="_Toc22582"/>
+      <w:bookmarkStart w:id="5" w:name="_Toc2174"/>
       <w:r>
         <w:t>DANH MỤC BẢNG BIỂU</w:t>
       </w:r>
@@ -5048,7 +5048,7 @@
       <w:pPr>
         <w:pStyle w:val="21"/>
       </w:pPr>
-      <w:bookmarkStart w:id="6" w:name="_Toc27887"/>
+      <w:bookmarkStart w:id="6" w:name="_Toc10425"/>
       <w:r>
         <w:t>GIỚI THIỆU ĐỀ TÀI</w:t>
       </w:r>
@@ -5063,7 +5063,7 @@
       <w:pPr>
         <w:pStyle w:val="23"/>
       </w:pPr>
-      <w:bookmarkStart w:id="7" w:name="_Toc23470"/>
+      <w:bookmarkStart w:id="7" w:name="_Toc11032"/>
       <w:r>
         <w:t>Bối cảnh và lý do chọn đề tài</w:t>
       </w:r>
@@ -5110,7 +5110,7 @@
       <w:pPr>
         <w:pStyle w:val="23"/>
       </w:pPr>
-      <w:bookmarkStart w:id="8" w:name="_Toc25183"/>
+      <w:bookmarkStart w:id="8" w:name="_Toc29111"/>
       <w:r>
         <w:t>Phát biểu bài toán</w:t>
       </w:r>
@@ -5206,7 +5206,7 @@
       <w:pPr>
         <w:pStyle w:val="23"/>
       </w:pPr>
-      <w:bookmarkStart w:id="9" w:name="_Toc2156"/>
+      <w:bookmarkStart w:id="9" w:name="_Toc4051"/>
       <w:r>
         <w:t>Mục tiêu của đề tài</w:t>
       </w:r>
@@ -5276,7 +5276,7 @@
       <w:pPr>
         <w:pStyle w:val="23"/>
       </w:pPr>
-      <w:bookmarkStart w:id="10" w:name="_Toc3861"/>
+      <w:bookmarkStart w:id="10" w:name="_Toc3589"/>
       <w:r>
         <w:t>Phạm vi và giới hạn</w:t>
       </w:r>
@@ -5334,7 +5334,7 @@
       <w:pPr>
         <w:pStyle w:val="23"/>
       </w:pPr>
-      <w:bookmarkStart w:id="11" w:name="_Toc23322"/>
+      <w:bookmarkStart w:id="11" w:name="_Toc16014"/>
       <w:r>
         <w:t>Bộ dữ liệu sử dụng</w:t>
       </w:r>
@@ -5344,7 +5344,7 @@
       <w:pPr>
         <w:pStyle w:val="25"/>
       </w:pPr>
-      <w:bookmarkStart w:id="12" w:name="_Toc14267"/>
+      <w:bookmarkStart w:id="12" w:name="_Toc19845"/>
       <w:r>
         <w:t>Nguồn và quy mô dữ liệu</w:t>
       </w:r>
@@ -6204,7 +6204,7 @@
       <w:pPr>
         <w:pStyle w:val="25"/>
       </w:pPr>
-      <w:bookmarkStart w:id="16" w:name="_Toc32187"/>
+      <w:bookmarkStart w:id="16" w:name="_Toc6429"/>
       <w:r>
         <w:t>Các đặc trưng của bộ dữ liệu</w:t>
       </w:r>
@@ -10535,7 +10535,7 @@
       <w:pPr>
         <w:pStyle w:val="25"/>
       </w:pPr>
-      <w:bookmarkStart w:id="19" w:name="_Toc32319"/>
+      <w:bookmarkStart w:id="19" w:name="_Toc32334"/>
       <w:r>
         <w:t>Đặc điểm dữ liệu lớn của bài toán</w:t>
       </w:r>
@@ -10985,7 +10985,7 @@
       <w:pPr>
         <w:pStyle w:val="23"/>
       </w:pPr>
-      <w:bookmarkStart w:id="21" w:name="_Toc4758"/>
+      <w:bookmarkStart w:id="21" w:name="_Toc8837"/>
       <w:r>
         <w:t>Kết quả đầu ra và giá trị dự kiến</w:t>
       </w:r>
@@ -11043,7 +11043,7 @@
       <w:pPr>
         <w:pStyle w:val="23"/>
       </w:pPr>
-      <w:bookmarkStart w:id="22" w:name="_Toc11163"/>
+      <w:bookmarkStart w:id="22" w:name="_Toc30576"/>
       <w:r>
         <w:t>Bố cục báo cáo</w:t>
       </w:r>
@@ -11095,7 +11095,7 @@
         <w:pStyle w:val="21"/>
         <w:pageBreakBefore/>
       </w:pPr>
-      <w:bookmarkStart w:id="23" w:name="_Toc22366"/>
+      <w:bookmarkStart w:id="23" w:name="_Toc15661"/>
       <w:r>
         <w:t>CƠ SỞ LÝ THUYẾT</w:t>
       </w:r>
@@ -11110,7 +11110,7 @@
       <w:pPr>
         <w:pStyle w:val="23"/>
       </w:pPr>
-      <w:bookmarkStart w:id="24" w:name="_Toc17612"/>
+      <w:bookmarkStart w:id="24" w:name="_Toc17130"/>
       <w:r>
         <w:t>Tổng quan về dữ liệu lớn</w:t>
       </w:r>
@@ -11193,7 +11193,7 @@
       <w:pPr>
         <w:pStyle w:val="23"/>
       </w:pPr>
-      <w:bookmarkStart w:id="25" w:name="_Toc27347"/>
+      <w:bookmarkStart w:id="25" w:name="_Toc32646"/>
       <w:r>
         <w:t>Hệ thống tệp phân tán Hadoop HDFS</w:t>
       </w:r>
@@ -11203,7 +11203,7 @@
       <w:pPr>
         <w:pStyle w:val="25"/>
       </w:pPr>
-      <w:bookmarkStart w:id="26" w:name="_Toc11390"/>
+      <w:bookmarkStart w:id="26" w:name="_Toc10286"/>
       <w:r>
         <w:t>Kiến trúc HDFS</w:t>
       </w:r>
@@ -11346,7 +11346,7 @@
       <w:pPr>
         <w:pStyle w:val="25"/>
       </w:pPr>
-      <w:bookmarkStart w:id="28" w:name="_Toc4140"/>
+      <w:bookmarkStart w:id="28" w:name="_Toc31472"/>
       <w:r>
         <w:t>Cơ chế đọc và ghi dữ liệu</w:t>
       </w:r>
@@ -11361,7 +11361,7 @@
       <w:pPr>
         <w:pStyle w:val="23"/>
       </w:pPr>
-      <w:bookmarkStart w:id="29" w:name="_Toc24387"/>
+      <w:bookmarkStart w:id="29" w:name="_Toc9193"/>
       <w:r>
         <w:t>Nền tảng xử lý dữ liệu Apache Spark</w:t>
       </w:r>
@@ -11371,7 +11371,7 @@
       <w:pPr>
         <w:pStyle w:val="25"/>
       </w:pPr>
-      <w:bookmarkStart w:id="30" w:name="_Toc26377"/>
+      <w:bookmarkStart w:id="30" w:name="_Toc28403"/>
       <w:r>
         <w:t>Tổng quan</w:t>
       </w:r>
@@ -11386,7 +11386,7 @@
       <w:pPr>
         <w:pStyle w:val="25"/>
       </w:pPr>
-      <w:bookmarkStart w:id="31" w:name="_Toc1609"/>
+      <w:bookmarkStart w:id="31" w:name="_Toc32488"/>
       <w:r>
         <w:t>RDD, DataFrame và cơ chế đánh giá lười</w:t>
       </w:r>
@@ -11450,7 +11450,7 @@
       <w:pPr>
         <w:pStyle w:val="25"/>
       </w:pPr>
-      <w:bookmarkStart w:id="32" w:name="_Toc959"/>
+      <w:bookmarkStart w:id="32" w:name="_Toc29436"/>
       <w:r>
         <w:t>Mô hình thực thi song song</w:t>
       </w:r>
@@ -11575,7 +11575,7 @@
       <w:pPr>
         <w:pStyle w:val="25"/>
       </w:pPr>
-      <w:bookmarkStart w:id="34" w:name="_Toc15593"/>
+      <w:bookmarkStart w:id="34" w:name="_Toc1365"/>
       <w:r>
         <w:t>Thư viện học máy Spark MLlib</w:t>
       </w:r>
@@ -11653,7 +11653,7 @@
       <w:pPr>
         <w:pStyle w:val="25"/>
       </w:pPr>
-      <w:bookmarkStart w:id="35" w:name="_Toc29500"/>
+      <w:bookmarkStart w:id="35" w:name="_Toc13117"/>
       <w:r>
         <w:t>Lý do lựa chọn HDFS và Spark</w:t>
       </w:r>
@@ -12225,7 +12225,7 @@
       <w:pPr>
         <w:pStyle w:val="23"/>
       </w:pPr>
-      <w:bookmarkStart w:id="37" w:name="_Toc1924"/>
+      <w:bookmarkStart w:id="37" w:name="_Toc10396"/>
       <w:r>
         <w:t>Bài toán dữ liệu mất cân bằng</w:t>
       </w:r>
@@ -12293,7 +12293,7 @@
       <w:pPr>
         <w:pStyle w:val="23"/>
       </w:pPr>
-      <w:bookmarkStart w:id="38" w:name="_Toc20181"/>
+      <w:bookmarkStart w:id="38" w:name="_Toc361"/>
       <w:r>
         <w:t>Các thuật toán sử dụng</w:t>
       </w:r>
@@ -12303,7 +12303,7 @@
       <w:pPr>
         <w:pStyle w:val="25"/>
       </w:pPr>
-      <w:bookmarkStart w:id="39" w:name="_Toc11922"/>
+      <w:bookmarkStart w:id="39" w:name="_Toc27064"/>
       <w:r>
         <w:t>Logistic Regression</w:t>
       </w:r>
@@ -12330,7 +12330,7 @@
       <w:pPr>
         <w:pStyle w:val="25"/>
       </w:pPr>
-      <w:bookmarkStart w:id="40" w:name="_Toc26558"/>
+      <w:bookmarkStart w:id="40" w:name="_Toc16472"/>
       <w:r>
         <w:t>Random Forest</w:t>
       </w:r>
@@ -12345,7 +12345,7 @@
       <w:pPr>
         <w:pStyle w:val="25"/>
       </w:pPr>
-      <w:bookmarkStart w:id="41" w:name="_Toc1734"/>
+      <w:bookmarkStart w:id="41" w:name="_Toc5824"/>
       <w:r>
         <w:t>Isolation Forest</w:t>
       </w:r>
@@ -12386,7 +12386,7 @@
       <w:pPr>
         <w:pStyle w:val="23"/>
       </w:pPr>
-      <w:bookmarkStart w:id="42" w:name="_Toc3830"/>
+      <w:bookmarkStart w:id="42" w:name="_Toc10722"/>
       <w:r>
         <w:t>Tạo đặc trưng thời gian dạng chu kỳ</w:t>
       </w:r>
@@ -12418,7 +12418,7 @@
       <w:pPr>
         <w:pStyle w:val="23"/>
       </w:pPr>
-      <w:bookmarkStart w:id="43" w:name="_Toc14263"/>
+      <w:bookmarkStart w:id="43" w:name="_Toc32223"/>
       <w:r>
         <w:t>Các độ đo đánh giá mô hình</w:t>
       </w:r>
@@ -12859,7 +12859,7 @@
       <w:pPr>
         <w:pStyle w:val="23"/>
       </w:pPr>
-      <w:bookmarkStart w:id="45" w:name="_Toc26101"/>
+      <w:bookmarkStart w:id="45" w:name="_Toc10348"/>
       <w:r>
         <w:t>Tinh chỉnh siêu tham số và ngưỡng phân loại</w:t>
       </w:r>
@@ -12932,7 +12932,7 @@
       <w:pPr>
         <w:pStyle w:val="23"/>
       </w:pPr>
-      <w:bookmarkStart w:id="46" w:name="_Toc23662"/>
+      <w:bookmarkStart w:id="46" w:name="_Toc2344"/>
       <w:r>
         <w:t>Giải thích mô hình với SHAP</w:t>
       </w:r>
@@ -12957,7 +12957,7 @@
         <w:pStyle w:val="21"/>
         <w:pageBreakBefore/>
       </w:pPr>
-      <w:bookmarkStart w:id="47" w:name="_Toc17752"/>
+      <w:bookmarkStart w:id="47" w:name="_Toc2555"/>
       <w:r>
         <w:t>XÂY DỰNG ỨNG DỤNG, TRỰC QUAN HÓA DỮ LIỆU</w:t>
       </w:r>
@@ -12972,7 +12972,7 @@
       <w:pPr>
         <w:pStyle w:val="23"/>
       </w:pPr>
-      <w:bookmarkStart w:id="48" w:name="_Toc30153"/>
+      <w:bookmarkStart w:id="48" w:name="_Toc4574"/>
       <w:r>
         <w:t>Kiến trúc tổng thể và luồng dữ liệu</w:t>
       </w:r>
@@ -13749,7 +13749,7 @@
       <w:pPr>
         <w:pStyle w:val="23"/>
       </w:pPr>
-      <w:bookmarkStart w:id="51" w:name="_Toc29278"/>
+      <w:bookmarkStart w:id="51" w:name="_Toc16590"/>
       <w:r>
         <w:t>Môi trường thực nghiệm</w:t>
       </w:r>
@@ -14442,7 +14442,7 @@
       <w:pPr>
         <w:pStyle w:val="23"/>
       </w:pPr>
-      <w:bookmarkStart w:id="53" w:name="_Toc9364"/>
+      <w:bookmarkStart w:id="53" w:name="_Toc28457"/>
       <w:r>
         <w:t>Lưu trữ dữ liệu trên HDFS</w:t>
       </w:r>
@@ -14504,7 +14504,7 @@
       <w:pPr>
         <w:pStyle w:val="23"/>
       </w:pPr>
-      <w:bookmarkStart w:id="54" w:name="_Toc24831"/>
+      <w:bookmarkStart w:id="54" w:name="_Toc17861"/>
       <w:r>
         <w:t>Khảo sát và trực quan hóa dữ liệu</w:t>
       </w:r>
@@ -14519,7 +14519,7 @@
       <w:pPr>
         <w:pStyle w:val="25"/>
       </w:pPr>
-      <w:bookmarkStart w:id="55" w:name="_Toc4549"/>
+      <w:bookmarkStart w:id="55" w:name="_Toc9044"/>
       <w:r>
         <w:t>Phân bố nhãn</w:t>
       </w:r>
@@ -14608,7 +14608,7 @@
       <w:pPr>
         <w:pStyle w:val="25"/>
       </w:pPr>
-      <w:bookmarkStart w:id="57" w:name="_Toc28626"/>
+      <w:bookmarkStart w:id="57" w:name="_Toc4910"/>
       <w:r>
         <w:t>Gian lận theo số tiền giao dịch</w:t>
       </w:r>
@@ -14715,7 +14715,7 @@
       <w:pPr>
         <w:pStyle w:val="25"/>
       </w:pPr>
-      <w:bookmarkStart w:id="59" w:name="_Toc23872"/>
+      <w:bookmarkStart w:id="59" w:name="_Toc25599"/>
       <w:r>
         <w:t>Gian lận theo giờ trong ngày</w:t>
       </w:r>
@@ -14892,7 +14892,7 @@
       <w:pPr>
         <w:pStyle w:val="25"/>
       </w:pPr>
-      <w:bookmarkStart w:id="62" w:name="_Toc13352"/>
+      <w:bookmarkStart w:id="62" w:name="_Toc8865"/>
       <w:r>
         <w:t>Quan hệ giữa các đặc trưng</w:t>
       </w:r>
@@ -15139,7 +15139,7 @@
       <w:pPr>
         <w:pStyle w:val="23"/>
       </w:pPr>
-      <w:bookmarkStart w:id="66" w:name="_Toc28681"/>
+      <w:bookmarkStart w:id="66" w:name="_Toc23792"/>
       <w:r>
         <w:t>Làm sạch và tiền xử lý dữ liệu</w:t>
       </w:r>
@@ -15149,7 +15149,7 @@
       <w:pPr>
         <w:pStyle w:val="25"/>
       </w:pPr>
-      <w:bookmarkStart w:id="67" w:name="_Toc24584"/>
+      <w:bookmarkStart w:id="67" w:name="_Toc28434"/>
       <w:r>
         <w:t>Dữ liệu thiếu và trùng lặp</w:t>
       </w:r>
@@ -15164,7 +15164,7 @@
       <w:pPr>
         <w:pStyle w:val="25"/>
       </w:pPr>
-      <w:bookmarkStart w:id="68" w:name="_Toc13529"/>
+      <w:bookmarkStart w:id="68" w:name="_Toc19052"/>
       <w:r>
         <w:t>Phân tích ngoại lệ</w:t>
       </w:r>
@@ -15640,7 +15640,7 @@
       <w:pPr>
         <w:pStyle w:val="25"/>
       </w:pPr>
-      <w:bookmarkStart w:id="71" w:name="_Toc22760"/>
+      <w:bookmarkStart w:id="71" w:name="_Toc17489"/>
       <w:r>
         <w:t>Tạo đặc trưng giờ trong ngày</w:t>
       </w:r>
@@ -16139,7 +16139,7 @@
       <w:pPr>
         <w:pStyle w:val="25"/>
       </w:pPr>
-      <w:bookmarkStart w:id="73" w:name="_Toc4710"/>
+      <w:bookmarkStart w:id="73" w:name="_Toc12084"/>
       <w:r>
         <w:t>Chuẩn hóa dữ liệu</w:t>
       </w:r>
@@ -16154,7 +16154,7 @@
       <w:pPr>
         <w:pStyle w:val="25"/>
       </w:pPr>
-      <w:bookmarkStart w:id="74" w:name="_Toc3420"/>
+      <w:bookmarkStart w:id="74" w:name="_Toc12163"/>
       <w:r>
         <w:t>Chia tập huấn luyện và kiểm tra theo thời gian</w:t>
       </w:r>
@@ -16243,7 +16243,7 @@
       <w:pPr>
         <w:pStyle w:val="23"/>
       </w:pPr>
-      <w:bookmarkStart w:id="76" w:name="_Toc7392"/>
+      <w:bookmarkStart w:id="76" w:name="_Toc19362"/>
       <w:r>
         <w:t>Xử lý dữ liệu mất cân bằng</w:t>
       </w:r>
@@ -16355,7 +16355,7 @@
       <w:pPr>
         <w:pStyle w:val="23"/>
       </w:pPr>
-      <w:bookmarkStart w:id="78" w:name="_Toc18705"/>
+      <w:bookmarkStart w:id="78" w:name="_Toc16469"/>
       <w:r>
         <w:t>Huấn luyện mô hình</w:t>
       </w:r>
@@ -16850,7 +16850,7 @@
       <w:pPr>
         <w:pStyle w:val="23"/>
       </w:pPr>
-      <w:bookmarkStart w:id="80" w:name="_Toc24694"/>
+      <w:bookmarkStart w:id="80" w:name="_Toc26233"/>
       <w:r>
         <w:t>Tinh chỉnh siêu tham số</w:t>
       </w:r>
@@ -17326,7 +17326,7 @@
       <w:pPr>
         <w:pStyle w:val="23"/>
       </w:pPr>
-      <w:bookmarkStart w:id="83" w:name="_Toc462"/>
+      <w:bookmarkStart w:id="83" w:name="_Toc2309"/>
       <w:r>
         <w:t>Đánh giá và so sánh mô hình</w:t>
       </w:r>
@@ -18370,7 +18370,7 @@
       <w:pPr>
         <w:pStyle w:val="25"/>
       </w:pPr>
-      <w:bookmarkStart w:id="90" w:name="_Toc29918"/>
+      <w:bookmarkStart w:id="90" w:name="_Toc15715"/>
       <w:r>
         <w:t>Ảnh hưởng của đặc trưng giờ</w:t>
       </w:r>
@@ -18957,7 +18957,7 @@
       <w:pPr>
         <w:pStyle w:val="25"/>
       </w:pPr>
-      <w:bookmarkStart w:id="93" w:name="_Toc11605"/>
+      <w:bookmarkStart w:id="93" w:name="_Toc31604"/>
       <w:r>
         <w:t>Phân tích và thảo luận</w:t>
       </w:r>
@@ -19033,7 +19033,7 @@
       <w:pPr>
         <w:pStyle w:val="23"/>
       </w:pPr>
-      <w:bookmarkStart w:id="94" w:name="_Toc18991"/>
+      <w:bookmarkStart w:id="94" w:name="_Toc25140"/>
       <w:r>
         <w:t>Trực quan hóa giao dịch nghi vấn</w:t>
       </w:r>
@@ -19131,7 +19131,7 @@
       <w:pPr>
         <w:pStyle w:val="23"/>
       </w:pPr>
-      <w:bookmarkStart w:id="96" w:name="_Toc28494"/>
+      <w:bookmarkStart w:id="96" w:name="_Toc29645"/>
       <w:r>
         <w:t>Ứng dụng minh họa</w:t>
       </w:r>
@@ -19235,7 +19235,7 @@
       <w:pPr>
         <w:pStyle w:val="23"/>
       </w:pPr>
-      <w:bookmarkStart w:id="97" w:name="_Toc24986"/>
+      <w:bookmarkStart w:id="97" w:name="_Toc13159"/>
       <w:r>
         <w:t>Hạn chế của giải pháp</w:t>
       </w:r>
@@ -19294,7 +19294,7 @@
         <w:pStyle w:val="36"/>
         <w:pageBreakBefore/>
       </w:pPr>
-      <w:bookmarkStart w:id="98" w:name="_Toc10158"/>
+      <w:bookmarkStart w:id="98" w:name="_Toc1433"/>
       <w:r>
         <w:t>KẾT LUẬN VÀ HƯỚNG PHÁT TRIỂN</w:t>
       </w:r>
@@ -19420,7 +19420,7 @@
         <w:pStyle w:val="36"/>
         <w:pageBreakBefore/>
       </w:pPr>
-      <w:bookmarkStart w:id="99" w:name="_Toc30905"/>
+      <w:bookmarkStart w:id="99" w:name="_Toc20855"/>
       <w:r>
         <w:t>TÀI LIỆU THAM KHẢO</w:t>
       </w:r>
@@ -20148,10 +20148,10 @@
     <w:lsdException w:uiPriority="99" w:name="index 7"/>
     <w:lsdException w:uiPriority="99" w:name="index 8"/>
     <w:lsdException w:uiPriority="99" w:name="index 9"/>
-    <w:lsdException w:qFormat="1" w:uiPriority="39" w:semiHidden="0" w:name="toc 1"/>
-    <w:lsdException w:qFormat="1" w:uiPriority="39" w:semiHidden="0" w:name="toc 2"/>
-    <w:lsdException w:qFormat="1" w:uiPriority="39" w:semiHidden="0" w:name="toc 3"/>
-    <w:lsdException w:qFormat="1" w:uiPriority="39" w:semiHidden="0" w:name="toc 4"/>
+    <w:lsdException w:uiPriority="39" w:semiHidden="0" w:name="toc 1"/>
+    <w:lsdException w:uiPriority="39" w:semiHidden="0" w:name="toc 2"/>
+    <w:lsdException w:uiPriority="39" w:semiHidden="0" w:name="toc 3"/>
+    <w:lsdException w:uiPriority="39" w:semiHidden="0" w:name="toc 4"/>
     <w:lsdException w:uiPriority="39" w:name="toc 5"/>
     <w:lsdException w:uiPriority="39" w:name="toc 6"/>
     <w:lsdException w:uiPriority="39" w:name="toc 7"/>
@@ -20161,10 +20161,10 @@
     <w:lsdException w:uiPriority="99" w:name="footnote text"/>
     <w:lsdException w:uiPriority="99" w:name="annotation text"/>
     <w:lsdException w:qFormat="1" w:uiPriority="99" w:semiHidden="0" w:name="header"/>
-    <w:lsdException w:qFormat="1" w:uiPriority="99" w:semiHidden="0" w:name="footer"/>
+    <w:lsdException w:uiPriority="99" w:semiHidden="0" w:name="footer"/>
     <w:lsdException w:uiPriority="99" w:name="index heading"/>
     <w:lsdException w:qFormat="1" w:uiPriority="35" w:semiHidden="0" w:name="caption"/>
-    <w:lsdException w:qFormat="1" w:uiPriority="99" w:semiHidden="0" w:name="table of figures"/>
+    <w:lsdException w:uiPriority="99" w:semiHidden="0" w:name="table of figures"/>
     <w:lsdException w:uiPriority="99" w:name="envelope address"/>
     <w:lsdException w:uiPriority="99" w:name="envelope return"/>
     <w:lsdException w:uiPriority="99" w:name="footnote reference"/>
@@ -20215,7 +20215,7 @@
     <w:lsdException w:uiPriority="99" w:name="Body Text Indent 3"/>
     <w:lsdException w:uiPriority="99" w:name="Block Text"/>
     <w:lsdException w:qFormat="1" w:uiPriority="99" w:semiHidden="0" w:name="Hyperlink"/>
-    <w:lsdException w:qFormat="1" w:uiPriority="99" w:name="FollowedHyperlink"/>
+    <w:lsdException w:uiPriority="99" w:name="FollowedHyperlink"/>
     <w:lsdException w:qFormat="1" w:unhideWhenUsed="0" w:uiPriority="22" w:semiHidden="0" w:name="Strong"/>
     <w:lsdException w:qFormat="1" w:unhideWhenUsed="0" w:uiPriority="20" w:semiHidden="0" w:name="Emphasis"/>
     <w:lsdException w:uiPriority="99" w:name="Document Map"/>
@@ -20509,7 +20509,6 @@
     <w:basedOn w:val="5"/>
     <w:semiHidden/>
     <w:unhideWhenUsed/>
-    <w:qFormat/>
     <w:uiPriority w:val="99"/>
     <w:rPr>
       <w:color w:val="954F72" w:themeColor="followedHyperlink"/>
@@ -20526,7 +20525,6 @@
     <w:basedOn w:val="1"/>
     <w:link w:val="31"/>
     <w:unhideWhenUsed/>
-    <w:qFormat/>
     <w:uiPriority w:val="99"/>
     <w:pPr>
       <w:tabs>
@@ -20619,7 +20617,6 @@
     <w:basedOn w:val="1"/>
     <w:next w:val="1"/>
     <w:unhideWhenUsed/>
-    <w:qFormat/>
     <w:uiPriority w:val="99"/>
     <w:pPr>
       <w:spacing w:after="0"/>
@@ -20631,7 +20628,6 @@
     <w:next w:val="1"/>
     <w:autoRedefine/>
     <w:unhideWhenUsed/>
-    <w:qFormat/>
     <w:uiPriority w:val="39"/>
     <w:pPr>
       <w:spacing w:after="100"/>
@@ -20646,7 +20642,6 @@
     <w:next w:val="1"/>
     <w:autoRedefine/>
     <w:unhideWhenUsed/>
-    <w:qFormat/>
     <w:uiPriority w:val="39"/>
     <w:pPr>
       <w:spacing w:after="100"/>
@@ -20659,7 +20654,6 @@
     <w:next w:val="1"/>
     <w:autoRedefine/>
     <w:unhideWhenUsed/>
-    <w:qFormat/>
     <w:uiPriority w:val="39"/>
     <w:pPr>
       <w:tabs>
@@ -20675,7 +20669,6 @@
     <w:next w:val="1"/>
     <w:autoRedefine/>
     <w:unhideWhenUsed/>
-    <w:qFormat/>
     <w:uiPriority w:val="39"/>
     <w:pPr>
       <w:spacing w:after="100"/>
@@ -20711,6 +20704,7 @@
         <w:numId w:val="1"/>
       </w:numPr>
       <w:jc w:val="center"/>
+      <w:outlineLvl w:val="0"/>
     </w:pPr>
     <w:rPr>
       <w:b/>
@@ -20722,7 +20716,6 @@
     <w:name w:val="h1 Char"/>
     <w:basedOn w:val="5"/>
     <w:link w:val="21"/>
-    <w:qFormat/>
     <w:uiPriority w:val="0"/>
     <w:rPr>
       <w:b/>
@@ -20743,6 +20736,7 @@
         <w:numId w:val="1"/>
       </w:numPr>
       <w:jc w:val="left"/>
+      <w:outlineLvl w:val="1"/>
     </w:pPr>
     <w:rPr>
       <w:b/>
@@ -20753,7 +20747,6 @@
     <w:name w:val="h2 Char"/>
     <w:basedOn w:val="5"/>
     <w:link w:val="23"/>
-    <w:qFormat/>
     <w:uiPriority w:val="0"/>
     <w:rPr>
       <w:b/>
@@ -20774,6 +20767,7 @@
         <w:numId w:val="1"/>
       </w:numPr>
       <w:jc w:val="left"/>
+      <w:outlineLvl w:val="2"/>
     </w:pPr>
     <w:rPr>
       <w:b/>
@@ -20803,6 +20797,7 @@
       <w:numPr>
         <w:ilvl w:val="3"/>
       </w:numPr>
+      <w:outlineLvl w:val="3"/>
     </w:pPr>
     <w:rPr>
       <w:b w:val="0"/>
@@ -20848,7 +20843,6 @@
     <w:name w:val="Footer Char"/>
     <w:basedOn w:val="5"/>
     <w:link w:val="9"/>
-    <w:qFormat/>
     <w:uiPriority w:val="99"/>
     <w:rPr>
       <w:sz w:val="26"/>
@@ -20859,7 +20853,6 @@
     <w:basedOn w:val="5"/>
     <w:semiHidden/>
     <w:unhideWhenUsed/>
-    <w:qFormat/>
     <w:uiPriority w:val="99"/>
     <w:rPr>
       <w:color w:val="605E5C"/>
@@ -20871,7 +20864,6 @@
     <w:basedOn w:val="5"/>
     <w:link w:val="4"/>
     <w:semiHidden/>
-    <w:qFormat/>
     <w:uiPriority w:val="9"/>
     <w:rPr>
       <w:rFonts w:asciiTheme="majorHAnsi" w:hAnsiTheme="majorHAnsi" w:eastAsiaTheme="majorEastAsia" w:cstheme="majorBidi"/>
@@ -20885,7 +20877,6 @@
     <w:basedOn w:val="5"/>
     <w:link w:val="3"/>
     <w:semiHidden/>
-    <w:qFormat/>
     <w:uiPriority w:val="9"/>
     <w:rPr>
       <w:rFonts w:asciiTheme="majorHAnsi" w:hAnsiTheme="majorHAnsi" w:eastAsiaTheme="majorEastAsia" w:cstheme="majorBidi"/>
@@ -20898,7 +20889,6 @@
     <w:name w:val="Heading 1 Char"/>
     <w:basedOn w:val="5"/>
     <w:link w:val="2"/>
-    <w:qFormat/>
     <w:uiPriority w:val="9"/>
     <w:rPr>
       <w:rFonts w:asciiTheme="majorHAnsi" w:hAnsiTheme="majorHAnsi" w:eastAsiaTheme="majorEastAsia" w:cstheme="majorBidi"/>
@@ -20916,6 +20906,7 @@
     <w:uiPriority w:val="0"/>
     <w:pPr>
       <w:jc w:val="center"/>
+      <w:outlineLvl w:val="0"/>
     </w:pPr>
     <w:rPr>
       <w:b/>
@@ -20928,7 +20919,6 @@
     <w:name w:val="More Char"/>
     <w:basedOn w:val="5"/>
     <w:link w:val="36"/>
-    <w:qFormat/>
     <w:uiPriority w:val="0"/>
     <w:rPr>
       <w:b/>

</xml_diff>